<commit_message>
Arbetar på den individuella uppgiften
</commit_message>
<xml_diff>
--- a/ITSX25_Workshop2_Individuell_Inlamningsuppgift_MITRE_ATTACK_Hotanalys_GVG.docx
+++ b/ITSX25_Workshop2_Individuell_Inlamningsuppgift_MITRE_ATTACK_Hotanalys_GVG.docx
@@ -1600,6 +1600,8 @@
       <w:r>
         <w:rPr>
           <w:color w:val="000000" w:themeColor="text1"/>
+          <w:highlight w:val="none"/>
+          <w:lang w:val="sv-SE"/>
         </w:rPr>
       </w:r>
       <w:r>
@@ -1638,8 +1640,6 @@
       <w:r>
         <w:rPr>
           <w:color w:val="000000" w:themeColor="text1"/>
-          <w:highlight w:val="none"/>
-          <w:lang w:val="sv-SE"/>
         </w:rPr>
       </w:r>
       <w:r>
@@ -1884,7 +1884,6 @@
       <w:r>
         <w:rPr>
           <w:color w:val="000000" w:themeColor="text1"/>
-          <w:highlight w:val="none"/>
         </w:rPr>
       </w:r>
       <w:r>
@@ -2107,6 +2106,8 @@
       <w:r>
         <w:rPr>
           <w:color w:val="000000" w:themeColor="text1"/>
+          <w:highlight w:val="none"/>
+          <w:lang w:val="sv-SE"/>
         </w:rPr>
       </w:r>
       <w:r>
@@ -2181,6 +2182,8 @@
       <w:r>
         <w:rPr>
           <w:color w:val="000000" w:themeColor="text1"/>
+          <w:highlight w:val="none"/>
+          <w:lang w:val="sv-SE"/>
         </w:rPr>
       </w:r>
       <w:r>
@@ -2262,8 +2265,6 @@
       <w:r>
         <w:rPr>
           <w:color w:val="000000" w:themeColor="text1"/>
-          <w:highlight w:val="none"/>
-          <w:lang w:val="sv-SE"/>
         </w:rPr>
       </w:r>
       <w:r>
@@ -2390,6 +2391,10 @@
       <w:r>
         <w:rPr>
           <w:color w:val="000000" w:themeColor="text1"/>
+          <w:sz w:val="18"/>
+          <w:szCs w:val="18"/>
+          <w:highlight w:val="none"/>
+          <w:lang w:val="sv-SE"/>
         </w:rPr>
       </w:r>
       <w:r>
@@ -2471,6 +2476,10 @@
       <w:r>
         <w:rPr>
           <w:color w:val="000000" w:themeColor="text1"/>
+          <w:sz w:val="18"/>
+          <w:szCs w:val="18"/>
+          <w:highlight w:val="none"/>
+          <w:lang w:val="sv-SE"/>
         </w:rPr>
       </w:r>
       <w:r>
@@ -2542,6 +2551,10 @@
       <w:r>
         <w:rPr>
           <w:color w:val="000000" w:themeColor="text1"/>
+          <w:sz w:val="18"/>
+          <w:szCs w:val="18"/>
+          <w:highlight w:val="none"/>
+          <w:lang w:val="sv-SE"/>
         </w:rPr>
       </w:r>
       <w:r>
@@ -2709,6 +2722,7 @@
         <w:rPr>
           <w:color w:val="000000" w:themeColor="text1"/>
           <w:sz w:val="18"/>
+          <w:szCs w:val="18"/>
           <w:highlight w:val="none"/>
           <w:lang w:val="sv-SE"/>
         </w:rPr>
@@ -2768,9 +2782,6 @@
       <w:r>
         <w:rPr>
           <w:color w:val="000000" w:themeColor="text1"/>
-          <w:sz w:val="18"/>
-          <w:highlight w:val="none"/>
-          <w:lang w:val="sv-SE"/>
         </w:rPr>
       </w:r>
       <w:r>
@@ -2878,6 +2889,8 @@
       <w:r>
         <w:rPr>
           <w:color w:val="000000" w:themeColor="text1"/>
+          <w:highlight w:val="none"/>
+          <w:lang w:val="sv-SE"/>
         </w:rPr>
       </w:r>
       <w:r>
@@ -2949,6 +2962,8 @@
       <w:r>
         <w:rPr>
           <w:color w:val="000000" w:themeColor="text1"/>
+          <w:highlight w:val="none"/>
+          <w:lang w:val="sv-SE"/>
         </w:rPr>
       </w:r>
       <w:r>
@@ -3017,8 +3032,6 @@
       <w:r>
         <w:rPr>
           <w:color w:val="000000" w:themeColor="text1"/>
-          <w:highlight w:val="none"/>
-          <w:lang w:val="sv-SE"/>
         </w:rPr>
       </w:r>
       <w:r>
@@ -3381,6 +3394,12 @@
           <w:lang w:val="sv-SE"/>
         </w:rPr>
       </w:r>
+      <w:r>
+        <w:rPr>
+          <w:highlight w:val="none"/>
+          <w:lang w:val="sv-SE"/>
+        </w:rPr>
+      </w:r>
     </w:p>
     <w:p>
       <w:pPr>
@@ -3398,6 +3417,12 @@
           <w:lang w:val="sv-SE"/>
         </w:rPr>
         <w:t xml:space="preserve">Men det blev lite sidospår.</w:t>
+      </w:r>
+      <w:r>
+        <w:rPr>
+          <w:highlight w:val="none"/>
+          <w:lang w:val="sv-SE"/>
+        </w:rPr>
       </w:r>
       <w:r>
         <w:rPr>
@@ -3463,7 +3488,7 @@
       <w:r>
         <w:rPr>
           <w:highlight w:val="none"/>
-          <w:lang w:val="sv-SE"/>
+          <w:lang w:val="sv-SE" w:bidi="sv-SE"/>
         </w:rPr>
       </w:r>
       <w:r>
@@ -3493,7 +3518,7 @@
       <w:r>
         <w:rPr>
           <w:highlight w:val="none"/>
-          <w:lang w:val="sv-SE"/>
+          <w:lang w:val="sv-SE" w:bidi="sv-SE"/>
         </w:rPr>
       </w:r>
       <w:r>
@@ -3530,7 +3555,7 @@
       <w:r>
         <w:rPr>
           <w:highlight w:val="none"/>
-          <w:lang w:val="sv-SE" w:bidi="sv-SE"/>
+          <w:lang w:val="sv-SE"/>
         </w:rPr>
       </w:r>
       <w:r>
@@ -3791,6 +3816,7 @@
       <w:r>
         <w:rPr>
           <w:color w:val="000000" w:themeColor="text1"/>
+          <w:lang w:val="sv-SE"/>
         </w:rPr>
       </w:r>
       <w:r>
@@ -3866,7 +3892,6 @@
       </w:r>
       <w:r>
         <w:rPr>
-          <w:color w:val="000000" w:themeColor="text1"/>
           <w:highlight w:val="none"/>
           <w:lang w:val="sv-SE"/>
         </w:rPr>
@@ -3944,6 +3969,7 @@
       </w:r>
       <w:r>
         <w:rPr>
+          <w:color w:val="000000" w:themeColor="text1"/>
           <w:highlight w:val="none"/>
           <w:lang w:val="sv-SE"/>
         </w:rPr>
@@ -4050,6 +4076,8 @@
       <w:r>
         <w:rPr>
           <w:color w:val="000000" w:themeColor="text1"/>
+          <w:highlight w:val="none"/>
+          <w:lang w:val="sv-SE"/>
         </w:rPr>
       </w:r>
       <w:r>
@@ -4121,8 +4149,6 @@
       <w:r>
         <w:rPr>
           <w:color w:val="000000" w:themeColor="text1"/>
-          <w:highlight w:val="none"/>
-          <w:lang w:val="sv-SE"/>
         </w:rPr>
       </w:r>
       <w:r>
@@ -4270,6 +4296,11 @@
           <w:color w:val="000000" w:themeColor="text1"/>
         </w:rPr>
       </w:r>
+      <w:r>
+        <w:rPr>
+          <w:color w:val="000000" w:themeColor="text1"/>
+        </w:rPr>
+      </w:r>
     </w:p>
     <w:p>
       <w:pPr>
@@ -4570,7 +4601,21 @@
           <w:lang w:val="sv-SE"/>
         </w:rPr>
         <w:br/>
-        <w:t xml:space="preserve">Valid Accounts är en teknik där någon utifrån har lyckats få tillgång till helt legitima användarkonton. Det kan vara användare som är anställda eller inhyrda av organisationen, men det kan även vara gamla konton som inte hanterats rätt och fortfarande har rättigheter trots att användaren inte längre har någon anknytning till organisationen.</w:t>
+        <w:t xml:space="preserve">Valid Accounts är </w:t>
+      </w:r>
+      <w:r>
+        <w:rPr>
+          <w:color w:val="000000" w:themeColor="text1"/>
+          <w:lang w:val="sv-SE"/>
+        </w:rPr>
+        <w:t xml:space="preserve">en teknik där någon utifrån har lyckats få tillgång till helt legitima användarkonton. Det kan vara användare som är anställda eller inhyrda av organisationen, men det kan även vara gamla konton som inte hanterats rätt och fortfarande har rättigheter trots</w:t>
+      </w:r>
+      <w:r>
+        <w:rPr>
+          <w:color w:val="000000" w:themeColor="text1"/>
+          <w:lang w:val="sv-SE"/>
+        </w:rPr>
+        <w:t xml:space="preserve"> att användaren inte längre har någon anknytning till organisationen.</w:t>
         <w:br/>
         <w:t xml:space="preserve">En signal för det kan vara att ett konto loggar in från en plats eller en IP som systemet inte känner igen, eller ett land som systemet inte tillåter att man loggar in från utan vidare. </w:t>
       </w:r>
@@ -4579,15 +4624,36 @@
           <w:color w:val="000000" w:themeColor="text1"/>
           <w:lang w:val="sv-SE"/>
         </w:rPr>
-        <w:t xml:space="preserve">Ett exempel som jag tror jag använt antingen i den här uppgiften eller i självstudierna (om jag inte tog bort det) var en arbetare som alltid jobbar på plats på ett företag men plötsligt loggar in från en helt okänd IP-adress.</w:t>
+        <w:t xml:space="preserve">Ett exempel som jag tror jag använt antingen i den här uppgiften eller i självstudierna (om jag inte tog bort det) var en arbetare som alltid jobbar på plats på ett före</w:t>
+      </w:r>
+      <w:r>
+        <w:rPr>
+          <w:color w:val="000000" w:themeColor="text1"/>
+          <w:lang w:val="sv-SE"/>
+        </w:rPr>
+        <w:t xml:space="preserve">tag men plötsligt loggar in från en helt okänd IP-adress.</w:t>
         <w:br/>
-        <w:t xml:space="preserve">En annan signal man kan tänka sig är att en användare plötsligt börjar bete sig på ett ovanligt sätt. Användaren kanske skannar nätverket eller skickar traffik på ett sätt den inte har gjort innan. Användaren kan även försöka komma åt andra konton eller data den inte har behörighet till.</w:t>
+        <w:t xml:space="preserve">En annan signal man kan tänka sig är att en användare plötsligt börjar bete sig på ett ovanligt sätt. Användaren kanske skannar nätverket eller skickar traffik på ett sätt den inte har gjort innan. </w:t>
+      </w:r>
+      <w:r>
+        <w:rPr>
+          <w:color w:val="000000" w:themeColor="text1"/>
+          <w:lang w:val="sv-SE"/>
+        </w:rPr>
+        <w:t xml:space="preserve">Användaren kan även försöka komma åt andra konton eller data den inte har behörighet till.</w:t>
         <w:br/>
         <w:t xml:space="preserve">Om det är möjligt inom budget och resurser bör säkerhetsteamet hålla utkik efter båda sorterna av signaler i realtid för att upptäcka ett potentiellt intrång tidigt.</w:t>
       </w:r>
       <w:r>
         <w:rPr>
           <w:color w:val="000000" w:themeColor="text1"/>
+        </w:rPr>
+      </w:r>
+      <w:r>
+        <w:rPr>
+          <w:color w:val="000000" w:themeColor="text1"/>
+          <w:highlight w:val="none"/>
+          <w:lang w:val="sv-SE"/>
         </w:rPr>
       </w:r>
     </w:p>
@@ -4663,11 +4729,25 @@
           <w:color w:val="000000" w:themeColor="text1"/>
           <w:lang w:val="sv-SE"/>
         </w:rPr>
-        <w:t xml:space="preserve">för att övervaka systemets resurser när det är så små skillnader det kan handla om. Det kan även handla om antingen spikar, eller knappt märkbar prestanda över en längre tid. Och säkerhetsteamet måste veta om prestandaändringen beror på en tjänst som någon i organisationen har startat, eller om det beror på något utifrån.</w:t>
+        <w:t xml:space="preserve">för att övervaka systemets resurser när det är så små skillnader de</w:t>
       </w:r>
       <w:r>
         <w:rPr>
           <w:color w:val="000000" w:themeColor="text1"/>
+          <w:lang w:val="sv-SE"/>
+        </w:rPr>
+        <w:t xml:space="preserve">t kan handla om. Det kan även handla om antingen spikar, eller knappt märkbar prestanda över en längre tid. Och säkerhetsteamet måste veta om prestandaändringen beror på en tjänst som någon i organisationen har startat, eller om det beror på något utifrån.</w:t>
+      </w:r>
+      <w:r>
+        <w:rPr>
+          <w:color w:val="000000" w:themeColor="text1"/>
+        </w:rPr>
+      </w:r>
+      <w:r>
+        <w:rPr>
+          <w:color w:val="000000" w:themeColor="text1"/>
+          <w:highlight w:val="none"/>
+          <w:lang w:val="sv-SE"/>
         </w:rPr>
       </w:r>
     </w:p>
@@ -4790,11 +4870,6 @@
           <w:color w:val="000000" w:themeColor="text1"/>
         </w:rPr>
       </w:r>
-      <w:r>
-        <w:rPr>
-          <w:color w:val="000000" w:themeColor="text1"/>
-        </w:rPr>
-      </w:r>
     </w:p>
     <w:p>
       <w:pPr>
@@ -4822,8 +4897,6 @@
       <w:r>
         <w:rPr>
           <w:color w:val="000000" w:themeColor="text1"/>
-          <w:highlight w:val="none"/>
-          <w:lang w:val="sv-SE"/>
         </w:rPr>
       </w:r>
     </w:p>
@@ -4903,6 +4976,14 @@
           <w:sz w:val="18"/>
           <w:szCs w:val="18"/>
           <w:highlight w:val="none"/>
+          <w:lang w:val="sv-SE"/>
+        </w:rPr>
+      </w:r>
+      <w:r>
+        <w:rPr>
+          <w:color w:val="000000" w:themeColor="text1"/>
+          <w:sz w:val="18"/>
+          <w:szCs w:val="18"/>
           <w:lang w:val="sv-SE"/>
         </w:rPr>
       </w:r>
@@ -4940,6 +5021,7 @@
         <w:rPr>
           <w:color w:val="000000" w:themeColor="text1"/>
           <w:sz w:val="18"/>
+          <w:szCs w:val="18"/>
           <w:highlight w:val="none"/>
           <w:lang w:val="sv-SE"/>
         </w:rPr>
@@ -4966,7 +5048,23 @@
         </w:rPr>
         <w:t xml:space="preserve">Mitigerande åtgärd: Account Use Policies</w:t>
         <w:br/>
-        <w:t xml:space="preserve">Kan låsa kontot efter ett antal misslyckade försök att logga in för att hindra att någon lyckas gissa lösenordet. Det kräver en balans så att användare inte låser ute sig själva hela tiden samtidigt som någon utifrån inte får ha för många försök på sig att gissa. Åtgärden kan även hindra inloggningar om de inte är från vissa bestämda platser.</w:t>
+        <w:t xml:space="preserve">Kan låsa kontot efter ett antal misslyckade försök att logga i</w:t>
+      </w:r>
+      <w:r>
+        <w:rPr>
+          <w:color w:val="000000" w:themeColor="text1"/>
+          <w:sz w:val="18"/>
+          <w:lang w:val="sv-SE"/>
+        </w:rPr>
+        <w:t xml:space="preserve">n för att hindra att någon lyckas gissa lösenordet. Det kräver en balans så att användare inte låser ute sig själva hela tiden samtidigt som någon utifrån inte får ha för många försök på sig att gissa. Åtgärden kan även hindra inloggningar om de inte är fr</w:t>
+      </w:r>
+      <w:r>
+        <w:rPr>
+          <w:color w:val="000000" w:themeColor="text1"/>
+          <w:sz w:val="18"/>
+          <w:lang w:val="sv-SE"/>
+        </w:rPr>
+        <w:t xml:space="preserve">ån vissa bestämda platser.</w:t>
         <w:br/>
         <w:t xml:space="preserve">Det är en bra åtgärd om den inte är för strikt eller för slapp, och den kan även användas som åtgärder för andra tekniker. Att sätta en policy för vilka IP-adresser som får ansluta borde stoppa en stor del skadlig trafik utifrån.</w:t>
       </w:r>
@@ -4975,7 +5073,15 @@
           <w:color w:val="000000" w:themeColor="text1"/>
         </w:rPr>
       </w:r>
-      <w:r/>
+      <w:r>
+        <w:rPr>
+          <w:color w:val="000000" w:themeColor="text1"/>
+          <w:sz w:val="18"/>
+          <w:szCs w:val="18"/>
+          <w:highlight w:val="none"/>
+          <w:lang w:val="sv-SE"/>
+        </w:rPr>
+      </w:r>
     </w:p>
     <w:p>
       <w:pPr>
@@ -5024,15 +5130,42 @@
         </w:rPr>
         <w:t xml:space="preserve">Mitigerande åtgärd: Multi-factor Authentication</w:t>
         <w:br/>
-        <w:t xml:space="preserve">Kräver att man visar vem man är på mer än ett sätt. Bara ett lösenord räcker inte. Man kan till exempel få använda sitt fingeravtryck, eller godkänna inloggningen i en app.</w:t>
+        <w:t xml:space="preserve">Kräve</w:t>
+      </w:r>
+      <w:r>
+        <w:rPr>
+          <w:color w:val="000000" w:themeColor="text1"/>
+          <w:sz w:val="18"/>
+          <w:highlight w:val="none"/>
+          <w:lang w:val="sv-SE"/>
+        </w:rPr>
+        <w:t xml:space="preserve">r att man visar vem man är på mer än ett sätt. Bara ett lösenord räcker inte. Man kan till exempel få använda sitt fingeravtryck, eller godkänna inloggningen i en app.</w:t>
         <w:br/>
-        <w:t xml:space="preserve">En väldigt användbar åtgärd. Den stoppar inte bara Brute Force utan kan stoppa angripare från att logga in efter att användarnamn och lösenord har läckt.</w:t>
+        <w:t xml:space="preserve">En väldigt användbar åtgärd. Den stoppar inte bara Brute Force utan kan stoppa angripare</w:t>
+      </w:r>
+      <w:r>
+        <w:rPr>
+          <w:color w:val="000000" w:themeColor="text1"/>
+          <w:sz w:val="18"/>
+          <w:highlight w:val="none"/>
+          <w:lang w:val="sv-SE"/>
+        </w:rPr>
+        <w:t xml:space="preserve"> från att logga in efter att användarnamn och lösenord har läckt.</w:t>
         <w:br/>
         <w:t xml:space="preserve">Man bör dock inte överdriva. Användare vill inte behöva skriva in lösenord, godkänna inloggningen i en app, och skriva in en kod som skickats i SMS bara för att man har tagit en timme lunch.</w:t>
       </w:r>
       <w:r>
         <w:rPr>
           <w:color w:val="000000" w:themeColor="text1"/>
+        </w:rPr>
+      </w:r>
+      <w:r>
+        <w:rPr>
+          <w:color w:val="000000" w:themeColor="text1"/>
+          <w:sz w:val="18"/>
+          <w:szCs w:val="18"/>
+          <w:highlight w:val="none"/>
+          <w:lang w:val="sv-SE"/>
         </w:rPr>
       </w:r>
     </w:p>
@@ -5095,15 +5228,60 @@
         <w:br/>
         <w:t xml:space="preserve">Åtgärden kan skydda mot läckta lösenord om användare byter tillräckligt ofta eller tvingas byta om en läcka misstänks.</w:t>
         <w:br/>
-        <w:t xml:space="preserve">Det kan vara besvärligt för användare med för många svåra lösenord, så det borde rekommenderas att använda en lösenordshanterare. Lösenordshanterare som är i molnet kommer med sina egna problem, så jag förespråkar personligen en lösenordshanterare som lagrar databasen med lösenord lokalt. Användaren måste fortfarande ha ett starkt lösenord till databasen eller sitt konto, och bör rotera lösenordet även där. Men det är bara ett lösenord att hålla reda på i taget.</w:t>
+        <w:t xml:space="preserve">Det kan v</w:t>
+      </w:r>
+      <w:r>
+        <w:rPr>
+          <w:color w:val="000000" w:themeColor="text1"/>
+          <w:sz w:val="18"/>
+          <w:highlight w:val="none"/>
+          <w:lang w:val="sv-SE"/>
+        </w:rPr>
+        <w:t xml:space="preserve">ara besvärligt för användare med för många svåra lösenord, så det borde rekommenderas att använda en lösenordshanterare. Lösenordshanterare som är i molnet kommer med sina egna problem, så jag förespråkar personligen en lösenordshanterare som lagrar databa</w:t>
+      </w:r>
+      <w:r>
+        <w:rPr>
+          <w:color w:val="000000" w:themeColor="text1"/>
+          <w:sz w:val="18"/>
+          <w:highlight w:val="none"/>
+          <w:lang w:val="sv-SE"/>
+        </w:rPr>
+        <w:t xml:space="preserve">sen med lösenord lokalt. Användaren måste fortfarande ha ett starkt lösenord till databasen eller sitt konto, och bör rotera lösenordet även där. Men det är bara ett lösenord att hålla reda på i taget.</w:t>
         <w:br/>
-        <w:t xml:space="preserve">Nackdelen med en sådan lösenordshanterare är att man ska låta bli att spara flera kopior av filen. Lokalt och på någon form av säker molnlagring räcker, men man ska inte ladda upp den på någon publik lagringsplats bara för att man tror att ingen kan knäcka ens lösenord. Om databasfilen läcker så kommer någon kunna ta sig in i den till slut, så innan det händer måste man gå igenom och byta lösenord på alla sparade inloggningar man har.</w:t>
+        <w:t xml:space="preserve">Nackdelen med en sådan lösenordshanterare är att man s</w:t>
+      </w:r>
+      <w:r>
+        <w:rPr>
+          <w:color w:val="000000" w:themeColor="text1"/>
+          <w:sz w:val="18"/>
+          <w:highlight w:val="none"/>
+          <w:lang w:val="sv-SE"/>
+        </w:rPr>
+        <w:t xml:space="preserve">ka låta bli att spara flera kopior av filen. Lokalt och på någon form av säker molnlagring räcker, men man ska inte ladda upp den på någon publik lagringsplats bara för att man tror att ingen kan knäcka ens lösenord. Om databasfilen läcker så kommer någon </w:t>
+      </w:r>
+      <w:r>
+        <w:rPr>
+          <w:color w:val="000000" w:themeColor="text1"/>
+          <w:sz w:val="18"/>
+          <w:highlight w:val="none"/>
+          <w:lang w:val="sv-SE"/>
+        </w:rPr>
+        <w:t xml:space="preserve">kunna ta sig in i den till slut, så innan det händer måste man gå igenom och byta lösenord på alla sparade inloggningar man har.</w:t>
         <w:br/>
         <w:t xml:space="preserve">Men det var ett sidospår. Mitigeringen hjälper mot angrepp, men man får inte heller här vara för strikt i hur man utformar den.</w:t>
       </w:r>
       <w:r>
         <w:rPr>
           <w:color w:val="000000" w:themeColor="text1"/>
+        </w:rPr>
+      </w:r>
+      <w:r>
+        <w:rPr>
+          <w:color w:val="000000" w:themeColor="text1"/>
+          <w:sz w:val="18"/>
+          <w:szCs w:val="18"/>
+          <w:highlight w:val="none"/>
+          <w:lang w:val="sv-SE"/>
         </w:rPr>
       </w:r>
     </w:p>
@@ -5152,17 +5330,44 @@
           <w:highlight w:val="none"/>
           <w:lang w:val="sv-SE"/>
         </w:rPr>
-        <w:t xml:space="preserve">Mitigerande åtgärd: User Account Management</w:t>
+        <w:t xml:space="preserve">Mitigerande </w:t>
+      </w:r>
+      <w:r>
+        <w:rPr>
+          <w:color w:val="000000" w:themeColor="text1"/>
+          <w:sz w:val="18"/>
+          <w:highlight w:val="none"/>
+          <w:lang w:val="sv-SE"/>
+        </w:rPr>
+        <w:t xml:space="preserve">åtgärd: User Account Management</w:t>
         <w:br/>
         <w:t xml:space="preserve">Åtgärden handlar om ett kontos livscykel och least privilege. Det hör även ihop lite med de tre tidigare åtgärderna.</w:t>
         <w:br/>
-        <w:t xml:space="preserve">Åtgärden säger att konton bara ska ha de behörigheter de behöver för att utföra sina roller (least privilege). Gå igenom konton regelbundet för att säkerställa att det inte ligger kvar gamla inaktuella behörigheter.</w:t>
+        <w:t xml:space="preserve">Åtgärden säger att konton bara ska ha de behörigheter de behöver för att utföra sina roller (least privileg</w:t>
+      </w:r>
+      <w:r>
+        <w:rPr>
+          <w:color w:val="000000" w:themeColor="text1"/>
+          <w:sz w:val="18"/>
+          <w:highlight w:val="none"/>
+          <w:lang w:val="sv-SE"/>
+        </w:rPr>
+        <w:t xml:space="preserve">e). Gå igenom konton regelbundet för att säkerställa att det inte ligger kvar gamla inaktuella behörigheter.</w:t>
         <w:br/>
         <w:t xml:space="preserve">Konton ska ha starka lösenord enligt Password Policies ovan.</w:t>
         <w:br/>
         <w:t xml:space="preserve">Konton ska låsas enligt Account Use Policies vid behov.</w:t>
         <w:br/>
-        <w:t xml:space="preserve">Konton ska använda sig av Multi-fact Authentication.</w:t>
+        <w:t xml:space="preserve">Konton ska använda sig av Mult</w:t>
+      </w:r>
+      <w:r>
+        <w:rPr>
+          <w:color w:val="000000" w:themeColor="text1"/>
+          <w:sz w:val="18"/>
+          <w:highlight w:val="none"/>
+          <w:lang w:val="sv-SE"/>
+        </w:rPr>
+        <w:t xml:space="preserve">i-fact Authentication.</w:t>
         <w:br/>
         <w:t xml:space="preserve">Åtgärden säger att inaktiva konton och konton utan ägare ska stängas av, gärna automatiskt efter en viss tids inaktivitet.</w:t>
         <w:br/>
@@ -5171,6 +5376,15 @@
       <w:r>
         <w:rPr>
           <w:color w:val="000000" w:themeColor="text1"/>
+        </w:rPr>
+      </w:r>
+      <w:r>
+        <w:rPr>
+          <w:color w:val="000000" w:themeColor="text1"/>
+          <w:sz w:val="18"/>
+          <w:szCs w:val="18"/>
+          <w:highlight w:val="none"/>
+          <w:lang w:val="sv-SE"/>
         </w:rPr>
       </w:r>
     </w:p>
@@ -5234,6 +5448,15 @@
           <w:color w:val="000000" w:themeColor="text1"/>
         </w:rPr>
       </w:r>
+      <w:r>
+        <w:rPr>
+          <w:color w:val="000000" w:themeColor="text1"/>
+          <w:sz w:val="18"/>
+          <w:szCs w:val="18"/>
+          <w:highlight w:val="none"/>
+          <w:lang w:val="sv-SE"/>
+        </w:rPr>
+      </w:r>
     </w:p>
     <w:p>
       <w:pPr>
@@ -5290,7 +5513,16 @@
         </w:rPr>
         <w:t xml:space="preserve">Mitigerande åtgärd: Behavior Prevention on Endpoint</w:t>
         <w:br/>
-        <w:t xml:space="preserve">Enligt MITREs databas är den här åtgärden en inställning i Windows 10, enable Attack Surface Reduction (ASR). Jag vet inte säkert men jag gissar att inställningen går att göra i Windows 11 också. Den är tänkt att hindra att osignerade eller okända exekverbara filer inte får köras från USB-enheter.</w:t>
+        <w:t xml:space="preserve">Enligt MITREs databas är den här åtgärden en inställning i Windows 10, enable Attac</w:t>
+      </w:r>
+      <w:r>
+        <w:rPr>
+          <w:color w:val="000000" w:themeColor="text1"/>
+          <w:sz w:val="18"/>
+          <w:highlight w:val="none"/>
+          <w:lang w:val="sv-SE"/>
+        </w:rPr>
+        <w:t xml:space="preserve">k Surface Reduction (ASR). Jag vet inte säkert men jag gissar att inställningen går att göra i Windows 11 också. Den är tänkt att hindra att osignerade eller okända exekverbara filer inte får köras från USB-enheter.</w:t>
         <w:br/>
         <w:t xml:space="preserve">I de flesta fall kanske det räcker, men </w:t>
       </w:r>
@@ -5301,11 +5533,29 @@
           <w:highlight w:val="none"/>
           <w:lang w:val="sv-SE"/>
         </w:rPr>
-        <w:t xml:space="preserve">jag har inte kunnat läsa mig till hur mycket det stoppar i praktiken. Flera skriptspråk är listade, och filtyper, men det står inget om språk och filer utöver det. Om man bara använder ASR så kommer antagligen någon ta sig förbi det på något sätt. Det skyddar dessutom bara Windows-system. Jag tror att Linux är byggt annorlunda så att tekniken inte går använda på samma sätt, men det skulle jag behöva läsa mer om.</w:t>
+        <w:t xml:space="preserve">jag har inte kunnat läsa mig till hur mycket det stoppar i praktiken. Flera skriptspråk är listade, och filtyper, men det står inget om språk och filer utöver </w:t>
       </w:r>
       <w:r>
         <w:rPr>
           <w:color w:val="000000" w:themeColor="text1"/>
+          <w:sz w:val="18"/>
+          <w:highlight w:val="none"/>
+          <w:lang w:val="sv-SE"/>
+        </w:rPr>
+        <w:t xml:space="preserve">det. Om man bara använder ASR så kommer antagligen någon ta sig förbi det på något sätt. Det skyddar dessutom bara Windows-system. Jag tror att Linux är byggt annorlunda så att tekniken inte går använda på samma sätt, men det skulle jag behöva läsa mer om.</w:t>
+      </w:r>
+      <w:r>
+        <w:rPr>
+          <w:color w:val="000000" w:themeColor="text1"/>
+        </w:rPr>
+      </w:r>
+      <w:r>
+        <w:rPr>
+          <w:color w:val="000000" w:themeColor="text1"/>
+          <w:sz w:val="18"/>
+          <w:szCs w:val="18"/>
+          <w:highlight w:val="none"/>
+          <w:lang w:val="sv-SE"/>
         </w:rPr>
       </w:r>
     </w:p>
@@ -5370,17 +5620,62 @@
         <w:br/>
         <w:t xml:space="preserve">Stäng av funktioner som inte används. Om användaren inte behöver Telnet så kan det vara avstängt.</w:t>
         <w:br/>
-        <w:t xml:space="preserve">Förhindra användare från att installera vilka program de vill. Hör ihop med CIS-kontrollen om tillåten mjukvara. Säkerhetsteamet kan inte patcha eller ta bort ett sårbart program om de inte vet att en användare har installerat det. Det bör även gå att stänga av möjligheten för användare med lägre behörighet att installera mjukvara över huvud taget.</w:t>
-        <w:br/>
-        <w:t xml:space="preserve">Ta bort tjänster som inte behövs. Samma som med funktioner och program. Att ta bort dessa minskar attackytan.</w:t>
-        <w:br/>
-        <w:t xml:space="preserve">Begränsa add-ons och plugins. Användarna kanske blir sura när de inte får kolla på Twitch med FrankerFacez och BTTV påslagna på arbetstid, men i det läget har det kanske gått för långt av andra skäl.</w:t>
-        <w:br/>
-        <w:t xml:space="preserve">Den här mitigerande åtgärden är till för att begränsa attackytan. Just fler tjänster och program som ligger och körs i bakgrunden utan att användas, desto högre risk är det att någonting har en sårbarhet som organisationen inte haft möjlighet att patcha bort. I en organisation bör det bara finnas den mjukvara och de konfigurationer som användarna behöver för att utföra sina jobb.</w:t>
+        <w:t xml:space="preserve">Förhindra användare</w:t>
       </w:r>
       <w:r>
         <w:rPr>
           <w:color w:val="000000" w:themeColor="text1"/>
+          <w:sz w:val="18"/>
+          <w:highlight w:val="none"/>
+          <w:lang w:val="sv-SE"/>
+        </w:rPr>
+        <w:t xml:space="preserve"> från att installera vilka program de vill. Hör ihop med CIS-kontrollen om tillåten mjukvara. Säkerhetsteamet kan inte patcha eller ta bort ett sårbart program om de inte vet att en användare har installerat det. Det bör även gå att stänga av möjligheten f</w:t>
+      </w:r>
+      <w:r>
+        <w:rPr>
+          <w:color w:val="000000" w:themeColor="text1"/>
+          <w:sz w:val="18"/>
+          <w:highlight w:val="none"/>
+          <w:lang w:val="sv-SE"/>
+        </w:rPr>
+        <w:t xml:space="preserve">ör användare med lägre behörighet att installera mjukvara över huvud taget.</w:t>
+        <w:br/>
+        <w:t xml:space="preserve">Ta bort tjänster som inte behövs. Samma som med funktioner och program. Att ta bort dessa minskar attackytan.</w:t>
+        <w:br/>
+        <w:t xml:space="preserve">Begränsa add-ons och plugins. Användarna kanske blir sura när de inte </w:t>
+      </w:r>
+      <w:r>
+        <w:rPr>
+          <w:color w:val="000000" w:themeColor="text1"/>
+          <w:sz w:val="18"/>
+          <w:highlight w:val="none"/>
+          <w:lang w:val="sv-SE"/>
+        </w:rPr>
+        <w:t xml:space="preserve">får kolla på Twitch med FrankerFacez och BTTV påslagna på arbetstid, men i det läget har det kanske gått för långt av andra skäl.</w:t>
+        <w:br/>
+        <w:t xml:space="preserve">Den här mitigerande åtgärden är till för att begränsa attackytan. Just fler tjänster och program som ligger och körs i bakgrun</w:t>
+      </w:r>
+      <w:r>
+        <w:rPr>
+          <w:color w:val="000000" w:themeColor="text1"/>
+          <w:sz w:val="18"/>
+          <w:highlight w:val="none"/>
+          <w:lang w:val="sv-SE"/>
+        </w:rPr>
+        <w:t xml:space="preserve">den utan att användas, desto högre risk är det att någonting har en sårbarhet som organisationen inte haft möjlighet att patcha bort. I en organisation bör det bara finnas den mjukvara och de konfigurationer som användarna behöver för att utföra sina jobb.</w:t>
+      </w:r>
+      <w:r>
+        <w:rPr>
+          <w:color w:val="000000" w:themeColor="text1"/>
+        </w:rPr>
+      </w:r>
+      <w:r>
+        <w:rPr>
+          <w:color w:val="000000" w:themeColor="text1"/>
+          <w:sz w:val="18"/>
+          <w:szCs w:val="18"/>
+          <w:highlight w:val="none"/>
+          <w:lang w:val="sv-SE"/>
         </w:rPr>
       </w:r>
     </w:p>
@@ -5427,9 +5722,27 @@
         </w:rPr>
         <w:t xml:space="preserve">Mitigerande åtgärd: Limit Hardware Installation</w:t>
         <w:br/>
-        <w:t xml:space="preserve">Den här åtgärden har jag varit med om i verkligheten. På en tidigare praktikplats var det förbjudet att koppla in USB-enheter i datorerna. Skulle vi ladda telefonerna fick vi inte använda datorn, utan var tvungna att ladda via eluttaget. Vi fick inte heller sätta in några USB-stickor i datorerna, och vi fick vara försiktiga med tangentbord och möss som kunde ha något minne i sig.</w:t>
+        <w:t xml:space="preserve">Den här åtgärden har jag varit med om i verkligheten. På en tidigare praktikplats var det förbjudet att koppla in USB-enheter i datorerna. Skulle vi</w:t>
+      </w:r>
+      <w:r>
+        <w:rPr>
+          <w:color w:val="000000" w:themeColor="text1"/>
+          <w:sz w:val="18"/>
+          <w:highlight w:val="none"/>
+          <w:lang w:val="sv-SE"/>
+        </w:rPr>
+        <w:t xml:space="preserve"> ladda telefonerna fick vi inte använda datorn, utan var tvungna att ladda via eluttaget. Vi fick inte heller sätta in några USB-stickor i datorerna, och vi fick vara försiktiga med tangentbord och möss som kunde ha något minne i sig.</w:t>
         <w:br/>
-        <w:t xml:space="preserve">USB går att stänga av på en mjukvarunivå, så att systemet inte läser av någon data därifrån. I beskrivningen på åtgärden står det även att det ska finnas starka lösenord till BIOS/UEFI, så jag antar att det går stänga av nära hårdvaran också.</w:t>
+        <w:t xml:space="preserve">USB går att stänga av</w:t>
+      </w:r>
+      <w:r>
+        <w:rPr>
+          <w:color w:val="000000" w:themeColor="text1"/>
+          <w:sz w:val="18"/>
+          <w:highlight w:val="none"/>
+          <w:lang w:val="sv-SE"/>
+        </w:rPr>
+        <w:t xml:space="preserve"> på en mjukvarunivå, så att systemet inte läser av någon data därifrån. I beskrivningen på åtgärden står det även att det ska finnas starka lösenord till BIOS/UEFI, så jag antar att det går stänga av nära hårdvaran också.</w:t>
         <w:br/>
         <w:t xml:space="preserve">Det är en bra åtgärd. Vi har sett </w:t>
       </w:r>
@@ -5440,7 +5753,7 @@
           <w:highlight w:val="none"/>
           <w:lang w:val="sv-SE"/>
         </w:rPr>
-        <w:t xml:space="preserve">roliga exempel på människor som lagt in skadlig kod i vad som ser ut att vara en vanlig USB-kabel, men som är ett förklätt USB-minne. På min praktik fick jag även instruktioner om att inte sätta in USB-minnen jag hittar på gatan i någon dator. På praktiken skulle jag lämna in det till säkerhetsteamet. Jag hittade aldrig något minne, men nu vet jag att jag inte ska sätta in något sånt i min dator hemma.</w:t>
+        <w:t xml:space="preserve">roliga exempel på människor som lagt in skadlig kod i vad som ser ut att vara en vanlig USB-kabel, men som är ett förklätt USB-minne. På min praktik </w:t>
       </w:r>
       <w:r>
         <w:rPr>
@@ -5448,6 +5761,20 @@
           <w:sz w:val="18"/>
           <w:highlight w:val="none"/>
           <w:lang w:val="sv-SE"/>
+        </w:rPr>
+        <w:t xml:space="preserve">fick jag även instruktioner om att inte sätta in USB-minnen jag hittar på gatan i någon dator. På praktiken skulle jag lämna in det till säkerhetsteamet. Jag hittade aldrig något minne, men nu vet jag att jag inte ska sätta in något sånt i min dator hemma.</w:t>
+      </w:r>
+      <w:r>
+        <w:rPr>
+          <w:color w:val="000000" w:themeColor="text1"/>
+          <w:sz w:val="18"/>
+          <w:highlight w:val="none"/>
+          <w:lang w:val="sv-SE"/>
+        </w:rPr>
+      </w:r>
+      <w:r>
+        <w:rPr>
+          <w:color w:val="000000" w:themeColor="text1"/>
         </w:rPr>
       </w:r>
     </w:p>
@@ -5522,6 +5849,18 @@
           <w:color w:val="000000" w:themeColor="text1"/>
           <w:lang w:val="sv-SE"/>
         </w:rPr>
+        <w:t xml:space="preserve">En attackkedja visar vilka tekniker en angripare använt. I den bästa av världar har säkerhetsteamet tittat igenom matrisen, analyserat vilka tekniker som är relevanta för organisationen, och därefter kommit fram till vilka tekniker som är viktigast att fokusera på. Säkerhetsteamet kan då se vilka tekniker som kan användas efter varandra och vilka som inte kan användas efter varandra. </w:t>
+      </w:r>
+      <w:r>
+        <w:rPr>
+          <w:color w:val="000000" w:themeColor="text1"/>
+          <w:lang w:val="sv-SE"/>
+        </w:rPr>
+        <w:t xml:space="preserve">Ett exempel på det senare kan vara att en angripare fysiskt tar sig in i ett isolerat produktionsnätverk utan internetanslutning, där de inte enkelt kan få ut data via en extern uppkoppling.</w:t>
+        <w:br/>
+        <w:t xml:space="preserve">Om säkerhetsteamet inte har haft möjlighet att se över matrisen så kan de fortfarande använda den genom att gå igenom vad som har hänt, identifiera teknikerna som har använts, och använda mitigerande åtgärder för att samma incident inte ska inträffa igen.</w:t>
+        <w:br/>
+        <w:t xml:space="preserve">Matrisen gör det lättare för säkerhetsteamet och ledningen att följa upp incidenter och planerade åtgärder. När säkerhetsteamet identifierat en risk kan de planera in åtgärder, som de sedan kan presentera för organisationen.</w:t>
       </w:r>
       <w:r>
         <w:rPr>
@@ -5537,6 +5876,15 @@
         <w:rPr/>
       </w:pPr>
       <w:r/>
+      <w:r>
+        <w:rPr>
+          <w:lang w:val="sv-SE"/>
+        </w:rPr>
+        <w:t xml:space="preserve">För att använda attackkedjan vi satte ihop i gruppen, så är första steget phishing. Vi tänker oss att säkerhetsteamet kan se att det redan har hänt, eller att risken finns att det händer. De läser på om tekniken, och vilka mitigerande åtgärder som är rekommenderade. Om risken för phishing är tillräckligt hög, vilket den ofta är, behöver åtgärder genomföras även om de kan påverka organisationens arbetsflöde. Antivirus kan påverka arbetet men relativt lite, men att blockera innehåll online kan riskera att störa mer. Man får även tänka på att användare kan bli irriterade av en sådan åtgärd. Även att träna användarna att förstå phishing kan påverka och ta tid från arbetet.</w:t>
+        <w:br/>
+        <w:t xml:space="preserve">Nästa steg i vår kedja är User Execution. Säkerhetsteamet kanske anser att åtgärderna mot phishing är tillräckliga, och risken är närmast eliminerad. Men då måste man tänka på vad som händer om phishing ändå inträffar och någon kommer åt systemet. Dessutom finns det andra sätt att ta sig in och få användare att köra kod. Därför bör även denna tekniken hanteras och åtgärdas. Samma tankesätt bör användas på det tredje steget. Bara för att man åtgärdar en risk i början av en kedja betyder inte det att riskerna senare åtgärdas av sig själva.</w:t>
+        <w:br/>
+      </w:r>
       <w:r/>
     </w:p>
     <w:p>
@@ -5612,62 +5960,265 @@
         <w:pBdr/>
         <w:spacing w:after="0"/>
         <w:ind/>
-        <w:rPr/>
+        <w:rPr>
+          <w:color w:val="000000" w:themeColor="text1"/>
+          <w:sz w:val="18"/>
+          <w:szCs w:val="18"/>
+          <w:highlight w:val="none"/>
+          <w:lang w:val="sv-SE"/>
+        </w:rPr>
       </w:pPr>
       <w:r>
         <w:rPr>
-          <w:color w:val="d0d7de"/>
+          <w:color w:val="000000" w:themeColor="text1"/>
           <w:sz w:val="18"/>
+          <w:lang w:val="sv-SE"/>
         </w:rPr>
-        <w:t xml:space="preserve">________________________________________________________________________________</w:t>
       </w:r>
-      <w:r/>
+      <w:hyperlink r:id="rId21" w:tooltip="https://attack.mitre.org/" w:history="1">
+        <w:r>
+          <w:rPr>
+            <w:rStyle w:val="889"/>
+            <w:color w:val="000000" w:themeColor="text1"/>
+            <w:sz w:val="18"/>
+            <w:lang w:val="sv-SE"/>
+          </w:rPr>
+          <w:t xml:space="preserve">MITRE ATT&amp;CK</w:t>
+        </w:r>
+      </w:hyperlink>
+      <w:r>
+        <w:rPr>
+          <w:color w:val="000000" w:themeColor="text1"/>
+          <w:sz w:val="18"/>
+          <w:lang w:val="sv-SE"/>
+        </w:rPr>
+        <w:br/>
+        <w:t xml:space="preserve">MITRE skapade både CVE-systemet (Common Vulnerabilities and Exposures) och matrisen vi använt hittills i kursen.</w:t>
+      </w:r>
+      <w:r>
+        <w:rPr>
+          <w:color w:val="000000" w:themeColor="text1"/>
+        </w:rPr>
+      </w:r>
     </w:p>
     <w:p>
       <w:pPr>
         <w:pBdr/>
         <w:spacing w:after="0"/>
         <w:ind/>
-        <w:rPr/>
+        <w:rPr>
+          <w:color w:val="000000" w:themeColor="text1"/>
+          <w:sz w:val="18"/>
+          <w:szCs w:val="18"/>
+          <w:highlight w:val="none"/>
+          <w:lang w:val="sv-SE"/>
+        </w:rPr>
       </w:pPr>
       <w:r>
         <w:rPr>
-          <w:color w:val="d0d7de"/>
+          <w:color w:val="000000" w:themeColor="text1"/>
           <w:sz w:val="18"/>
+          <w:highlight w:val="none"/>
+          <w:lang w:val="sv-SE"/>
         </w:rPr>
-        <w:t xml:space="preserve">________________________________________________________________________________</w:t>
       </w:r>
-      <w:r/>
+      <w:hyperlink r:id="rId22" w:tooltip="https://www.cve.org/" w:history="1">
+        <w:r>
+          <w:rPr>
+            <w:rStyle w:val="889"/>
+            <w:color w:val="000000" w:themeColor="text1"/>
+            <w:sz w:val="18"/>
+            <w:highlight w:val="none"/>
+            <w:lang w:val="sv-SE"/>
+          </w:rPr>
+          <w:t xml:space="preserve">CVE</w:t>
+        </w:r>
+      </w:hyperlink>
+      <w:r>
+        <w:rPr>
+          <w:color w:val="000000" w:themeColor="text1"/>
+          <w:sz w:val="18"/>
+          <w:highlight w:val="none"/>
+          <w:lang w:val="sv-SE"/>
+        </w:rPr>
+        <w:br/>
+      </w:r>
+      <w:r>
+        <w:rPr>
+          <w:color w:val="000000" w:themeColor="text1"/>
+          <w:sz w:val="18"/>
+          <w:highlight w:val="none"/>
+          <w:lang w:val="sv-SE"/>
+        </w:rPr>
+        <w:t xml:space="preserve">Databas med ”över 366000” sårbarheter.</w:t>
+      </w:r>
+      <w:r>
+        <w:rPr>
+          <w:color w:val="000000" w:themeColor="text1"/>
+        </w:rPr>
+      </w:r>
     </w:p>
     <w:p>
       <w:pPr>
         <w:pBdr/>
         <w:spacing w:after="0"/>
         <w:ind/>
-        <w:rPr/>
+        <w:rPr>
+          <w:color w:val="000000" w:themeColor="text1"/>
+          <w:sz w:val="18"/>
+          <w:szCs w:val="18"/>
+          <w:highlight w:val="none"/>
+          <w:lang w:val="sv-SE"/>
+        </w:rPr>
       </w:pPr>
       <w:r>
         <w:rPr>
-          <w:color w:val="d0d7de"/>
+          <w:color w:val="000000" w:themeColor="text1"/>
           <w:sz w:val="18"/>
+          <w:highlight w:val="none"/>
+          <w:lang w:val="sv-SE"/>
         </w:rPr>
-        <w:t xml:space="preserve">________________________________________________________________________________</w:t>
       </w:r>
-      <w:r/>
+      <w:r>
+        <w:rPr>
+          <w:color w:val="000000" w:themeColor="text1"/>
+          <w:sz w:val="18"/>
+          <w:highlight w:val="none"/>
+          <w:lang w:val="sv-SE"/>
+        </w:rPr>
+      </w:r>
+      <w:hyperlink r:id="rId23" w:tooltip="https://www.cisecurity.org/controls" w:history="1">
+        <w:r>
+          <w:rPr>
+            <w:rStyle w:val="889"/>
+            <w:color w:val="000000" w:themeColor="text1"/>
+            <w:sz w:val="18"/>
+            <w:highlight w:val="none"/>
+            <w:lang w:val="sv-SE"/>
+          </w:rPr>
+          <w:t xml:space="preserve">CIS-kontroller</w:t>
+        </w:r>
+      </w:hyperlink>
+      <w:r>
+        <w:rPr>
+          <w:color w:val="000000" w:themeColor="text1"/>
+          <w:sz w:val="18"/>
+          <w:highlight w:val="none"/>
+          <w:lang w:val="sv-SE"/>
+        </w:rPr>
+        <w:br/>
+        <w:t xml:space="preserve">En kravlista med de viktigaste säkerhetsåtgärderna en organisation bör genomföra för att minska de vanligaste riskerna.</w:t>
+      </w:r>
+      <w:r>
+        <w:rPr>
+          <w:color w:val="000000" w:themeColor="text1"/>
+        </w:rPr>
+      </w:r>
     </w:p>
     <w:p>
       <w:pPr>
         <w:pBdr/>
         <w:spacing w:after="0"/>
         <w:ind/>
-        <w:rPr/>
+        <w:rPr>
+          <w:color w:val="000000" w:themeColor="text1"/>
+          <w:sz w:val="18"/>
+          <w:szCs w:val="18"/>
+          <w:highlight w:val="none"/>
+          <w:lang w:val="sv-SE"/>
+        </w:rPr>
       </w:pPr>
       <w:r>
         <w:rPr>
-          <w:color w:val="d0d7de"/>
+          <w:color w:val="000000" w:themeColor="text1"/>
           <w:sz w:val="18"/>
+          <w:highlight w:val="none"/>
+          <w:lang w:val="sv-SE"/>
         </w:rPr>
-        <w:t xml:space="preserve">________________________________________________________________________________</w:t>
+      </w:r>
+      <w:r>
+        <w:rPr>
+          <w:color w:val="000000" w:themeColor="text1"/>
+          <w:sz w:val="18"/>
+          <w:highlight w:val="none"/>
+          <w:lang w:val="sv-SE"/>
+        </w:rPr>
+      </w:r>
+      <w:hyperlink r:id="rId24" w:tooltip="https://www.nist.gov/cyberframework" w:history="1">
+        <w:r>
+          <w:rPr>
+            <w:rStyle w:val="889"/>
+            <w:color w:val="000000" w:themeColor="text1"/>
+            <w:sz w:val="18"/>
+            <w:highlight w:val="none"/>
+            <w:lang w:val="sv-SE"/>
+          </w:rPr>
+          <w:t xml:space="preserve">NIST Cybersecurity Framework</w:t>
+        </w:r>
+      </w:hyperlink>
+      <w:r>
+        <w:rPr>
+          <w:color w:val="000000" w:themeColor="text1"/>
+          <w:sz w:val="18"/>
+          <w:highlight w:val="none"/>
+          <w:lang w:val="sv-SE"/>
+        </w:rPr>
+        <w:br/>
+        <w:t xml:space="preserve">Standard för hur en organisation hanterar risk och säkerhet.</w:t>
+      </w:r>
+      <w:r>
+        <w:rPr>
+          <w:color w:val="000000" w:themeColor="text1"/>
+        </w:rPr>
+      </w:r>
+    </w:p>
+    <w:p>
+      <w:pPr>
+        <w:pBdr/>
+        <w:spacing w:after="0"/>
+        <w:ind/>
+        <w:rPr>
+          <w:color w:val="000000" w:themeColor="text1"/>
+        </w:rPr>
+      </w:pPr>
+      <w:r>
+        <w:rPr>
+          <w:color w:val="000000" w:themeColor="text1"/>
+          <w:sz w:val="18"/>
+          <w:highlight w:val="none"/>
+          <w:lang w:val="sv-SE"/>
+        </w:rPr>
+      </w:r>
+      <w:hyperlink r:id="rId25" w:tooltip="https://www.nis-2-directive.com/" w:history="1">
+        <w:r>
+          <w:rPr>
+            <w:rStyle w:val="889"/>
+            <w:color w:val="000000" w:themeColor="text1"/>
+            <w:sz w:val="18"/>
+            <w:highlight w:val="none"/>
+            <w:lang w:val="sv-SE"/>
+          </w:rPr>
+          <w:t xml:space="preserve">NIS2</w:t>
+        </w:r>
+      </w:hyperlink>
+      <w:r>
+        <w:rPr>
+          <w:color w:val="000000" w:themeColor="text1"/>
+          <w:sz w:val="18"/>
+          <w:highlight w:val="none"/>
+          <w:lang w:val="sv-SE"/>
+        </w:rPr>
+        <w:br/>
+        <w:t xml:space="preserve">Nytt regelverk. Till skillnad från de andra är det här lagkrav och inte bara ett ramverk.</w:t>
+        <w:br/>
+      </w:r>
+      <w:r>
+        <w:rPr>
+          <w:color w:val="000000" w:themeColor="text1"/>
+          <w:sz w:val="18"/>
+          <w:highlight w:val="none"/>
+          <w:lang w:val="sv-SE"/>
+        </w:rPr>
       </w:r>
       <w:r/>
     </w:p>
@@ -5726,64 +6277,73 @@
         <w:pBdr/>
         <w:spacing w:after="0"/>
         <w:ind/>
-        <w:rPr/>
+        <w:rPr>
+          <w:color w:val="000000" w:themeColor="text1"/>
+          <w:sz w:val="18"/>
+          <w:szCs w:val="18"/>
+          <w:highlight w:val="none"/>
+          <w:lang w:val="sv-SE"/>
+        </w:rPr>
       </w:pPr>
       <w:r>
         <w:rPr>
-          <w:color w:val="d0d7de"/>
+          <w:color w:val="000000" w:themeColor="text1"/>
           <w:sz w:val="18"/>
+          <w:lang w:val="sv-SE"/>
         </w:rPr>
-        <w:t xml:space="preserve">________________________________________________________________________________</w:t>
+        <w:t xml:space="preserve">Vi använder oss av säkra källor, som MITRE ATT&amp;CK, och innan vi anser mappningen färdig kollar vi att tekniker stämmer överens med hur angripare beter sig i verkligheten. Som källa har stora organisationer inom cybersäkerhet högre trovärdighet än en blogg från 2016.</w:t>
+        <w:br/>
+        <w:t xml:space="preserve">***********</w:t>
+        <w:br/>
+        <w:t xml:space="preserve">* TODO *</w:t>
+        <w:br/>
+      </w:r>
+      <w:r>
+        <w:rPr>
+          <w:color w:val="000000" w:themeColor="text1"/>
+          <w:sz w:val="18"/>
+          <w:lang w:val="sv-SE"/>
+        </w:rPr>
+        <w:t xml:space="preserve">***********</w:t>
       </w:r>
       <w:r/>
-    </w:p>
-    <w:p>
-      <w:pPr>
-        <w:pBdr/>
-        <w:spacing w:after="0"/>
-        <w:ind/>
-        <w:rPr/>
-      </w:pPr>
       <w:r>
         <w:rPr>
-          <w:color w:val="d0d7de"/>
+          <w:color w:val="000000" w:themeColor="text1"/>
           <w:sz w:val="18"/>
+          <w:lang w:val="sv-SE"/>
         </w:rPr>
-        <w:t xml:space="preserve">________________________________________________________________________________</w:t>
       </w:r>
-      <w:r/>
-    </w:p>
-    <w:p>
-      <w:pPr>
-        <w:pBdr/>
-        <w:spacing w:after="0"/>
-        <w:ind/>
-        <w:rPr/>
-      </w:pPr>
       <w:r>
         <w:rPr>
-          <w:color w:val="d0d7de"/>
-          <w:sz w:val="18"/>
+          <w:color w:val="000000" w:themeColor="text1"/>
         </w:rPr>
-        <w:t xml:space="preserve">________________________________________________________________________________</w:t>
       </w:r>
-      <w:r/>
-    </w:p>
-    <w:p>
-      <w:pPr>
-        <w:pBdr/>
-        <w:spacing w:after="0"/>
-        <w:ind/>
-        <w:rPr/>
-      </w:pPr>
       <w:r>
         <w:rPr>
-          <w:color w:val="d0d7de"/>
+          <w:color w:val="000000" w:themeColor="text1"/>
           <w:sz w:val="18"/>
+          <w:highlight w:val="none"/>
+          <w:lang w:val="sv-SE"/>
         </w:rPr>
-        <w:t xml:space="preserve">________________________________________________________________________________</w:t>
       </w:r>
-      <w:r/>
+      <w:r>
+        <w:rPr>
+          <w:color w:val="000000" w:themeColor="text1"/>
+          <w:sz w:val="18"/>
+          <w:highlight w:val="none"/>
+          <w:lang w:val="sv-SE"/>
+        </w:rPr>
+      </w:r>
+      <w:r>
+        <w:rPr>
+          <w:color w:val="000000" w:themeColor="text1"/>
+          <w:sz w:val="18"/>
+          <w:szCs w:val="18"/>
+          <w:highlight w:val="none"/>
+          <w:lang w:val="sv-SE"/>
+        </w:rPr>
+      </w:r>
     </w:p>
     <w:p>
       <w:pPr>
@@ -6340,64 +6900,23 @@
         <w:pBdr/>
         <w:spacing w:after="0"/>
         <w:ind/>
-        <w:rPr/>
+        <w:rPr>
+          <w:color w:val="000000" w:themeColor="text1"/>
+        </w:rPr>
       </w:pPr>
       <w:r>
         <w:rPr>
-          <w:color w:val="d0d7de"/>
+          <w:color w:val="000000" w:themeColor="text1"/>
           <w:sz w:val="18"/>
+          <w:lang w:val="sv-SE"/>
         </w:rPr>
-        <w:t xml:space="preserve">________________________________________________________________________________</w:t>
+        <w:t xml:space="preserve">Om man skapar en attackkedja där en teknik är högt prioriterad, men de andra är lägre prioriterade, ska man då åtgärda alla delar i kedjan, eller den högst prioriterade och sedan åtgärda andra tekniker som är högt prioriterade men inte i kedjan?</w:t>
       </w:r>
-      <w:r/>
-    </w:p>
-    <w:p>
-      <w:pPr>
-        <w:pBdr/>
-        <w:spacing w:after="0"/>
-        <w:ind/>
-        <w:rPr/>
-      </w:pPr>
       <w:r>
         <w:rPr>
-          <w:color w:val="d0d7de"/>
-          <w:sz w:val="18"/>
+          <w:color w:val="000000" w:themeColor="text1"/>
         </w:rPr>
-        <w:t xml:space="preserve">________________________________________________________________________________</w:t>
       </w:r>
-      <w:r/>
-    </w:p>
-    <w:p>
-      <w:pPr>
-        <w:pBdr/>
-        <w:spacing w:after="0"/>
-        <w:ind/>
-        <w:rPr/>
-      </w:pPr>
-      <w:r>
-        <w:rPr>
-          <w:color w:val="d0d7de"/>
-          <w:sz w:val="18"/>
-        </w:rPr>
-        <w:t xml:space="preserve">________________________________________________________________________________</w:t>
-      </w:r>
-      <w:r/>
-    </w:p>
-    <w:p>
-      <w:pPr>
-        <w:pBdr/>
-        <w:spacing w:after="0"/>
-        <w:ind/>
-        <w:rPr/>
-      </w:pPr>
-      <w:r>
-        <w:rPr>
-          <w:color w:val="d0d7de"/>
-          <w:sz w:val="18"/>
-        </w:rPr>
-        <w:t xml:space="preserve">________________________________________________________________________________</w:t>
-      </w:r>
-      <w:r/>
     </w:p>
     <w:p>
       <w:pPr>
@@ -9500,6 +10019,153 @@
       <w:suff w:val="tab"/>
     </w:lvl>
   </w:abstractNum>
+  <w:abstractNum w:abstractNumId="11">
+    <w:nsid w:val="7BAA43AD"/>
+    <w:lvl w:ilvl="0">
+      <w:isLgl w:val="false"/>
+      <w:lvlJc w:val="left"/>
+      <w:lvlText w:val="–"/>
+      <w:numFmt w:val="bullet"/>
+      <w:pPr>
+        <w:pBdr/>
+        <w:spacing/>
+        <w:ind w:hanging="360" w:left="709"/>
+      </w:pPr>
+      <w:rPr>
+        <w:rFonts w:hint="default" w:ascii="Arial" w:hAnsi="Arial" w:eastAsia="Arial" w:cs="Arial"/>
+      </w:rPr>
+      <w:start w:val="1"/>
+      <w:suff w:val="tab"/>
+    </w:lvl>
+    <w:lvl w:ilvl="1">
+      <w:isLgl w:val="false"/>
+      <w:lvlJc w:val="left"/>
+      <w:lvlText w:val="o"/>
+      <w:numFmt w:val="bullet"/>
+      <w:pPr>
+        <w:pBdr/>
+        <w:spacing/>
+        <w:ind w:hanging="360" w:left="1429"/>
+      </w:pPr>
+      <w:rPr>
+        <w:rFonts w:hint="default" w:ascii="Courier New" w:hAnsi="Courier New" w:eastAsia="Courier New" w:cs="Courier New"/>
+      </w:rPr>
+      <w:start w:val="1"/>
+      <w:suff w:val="tab"/>
+    </w:lvl>
+    <w:lvl w:ilvl="2">
+      <w:isLgl w:val="false"/>
+      <w:lvlJc w:val="left"/>
+      <w:lvlText w:val="§"/>
+      <w:numFmt w:val="bullet"/>
+      <w:pPr>
+        <w:pBdr/>
+        <w:spacing/>
+        <w:ind w:hanging="360" w:left="2149"/>
+      </w:pPr>
+      <w:rPr>
+        <w:rFonts w:hint="default" w:ascii="Wingdings" w:hAnsi="Wingdings" w:eastAsia="Wingdings" w:cs="Wingdings"/>
+      </w:rPr>
+      <w:start w:val="1"/>
+      <w:suff w:val="tab"/>
+    </w:lvl>
+    <w:lvl w:ilvl="3">
+      <w:isLgl w:val="false"/>
+      <w:lvlJc w:val="left"/>
+      <w:lvlText w:val="·"/>
+      <w:numFmt w:val="bullet"/>
+      <w:pPr>
+        <w:pBdr/>
+        <w:spacing/>
+        <w:ind w:hanging="360" w:left="2869"/>
+      </w:pPr>
+      <w:rPr>
+        <w:rFonts w:hint="default" w:ascii="Symbol" w:hAnsi="Symbol" w:eastAsia="Symbol" w:cs="Symbol"/>
+      </w:rPr>
+      <w:start w:val="1"/>
+      <w:suff w:val="tab"/>
+    </w:lvl>
+    <w:lvl w:ilvl="4">
+      <w:isLgl w:val="false"/>
+      <w:lvlJc w:val="left"/>
+      <w:lvlText w:val="o"/>
+      <w:numFmt w:val="bullet"/>
+      <w:pPr>
+        <w:pBdr/>
+        <w:spacing/>
+        <w:ind w:hanging="360" w:left="3589"/>
+      </w:pPr>
+      <w:rPr>
+        <w:rFonts w:hint="default" w:ascii="Courier New" w:hAnsi="Courier New" w:eastAsia="Courier New" w:cs="Courier New"/>
+      </w:rPr>
+      <w:start w:val="1"/>
+      <w:suff w:val="tab"/>
+    </w:lvl>
+    <w:lvl w:ilvl="5">
+      <w:isLgl w:val="false"/>
+      <w:lvlJc w:val="left"/>
+      <w:lvlText w:val="§"/>
+      <w:numFmt w:val="bullet"/>
+      <w:pPr>
+        <w:pBdr/>
+        <w:spacing/>
+        <w:ind w:hanging="360" w:left="4309"/>
+      </w:pPr>
+      <w:rPr>
+        <w:rFonts w:hint="default" w:ascii="Wingdings" w:hAnsi="Wingdings" w:eastAsia="Wingdings" w:cs="Wingdings"/>
+      </w:rPr>
+      <w:start w:val="1"/>
+      <w:suff w:val="tab"/>
+    </w:lvl>
+    <w:lvl w:ilvl="6">
+      <w:isLgl w:val="false"/>
+      <w:lvlJc w:val="left"/>
+      <w:lvlText w:val="·"/>
+      <w:numFmt w:val="bullet"/>
+      <w:pPr>
+        <w:pBdr/>
+        <w:spacing/>
+        <w:ind w:hanging="360" w:left="5029"/>
+      </w:pPr>
+      <w:rPr>
+        <w:rFonts w:hint="default" w:ascii="Symbol" w:hAnsi="Symbol" w:eastAsia="Symbol" w:cs="Symbol"/>
+      </w:rPr>
+      <w:start w:val="1"/>
+      <w:suff w:val="tab"/>
+    </w:lvl>
+    <w:lvl w:ilvl="7">
+      <w:isLgl w:val="false"/>
+      <w:lvlJc w:val="left"/>
+      <w:lvlText w:val="o"/>
+      <w:numFmt w:val="bullet"/>
+      <w:pPr>
+        <w:pBdr/>
+        <w:spacing/>
+        <w:ind w:hanging="360" w:left="5749"/>
+      </w:pPr>
+      <w:rPr>
+        <w:rFonts w:hint="default" w:ascii="Courier New" w:hAnsi="Courier New" w:eastAsia="Courier New" w:cs="Courier New"/>
+      </w:rPr>
+      <w:start w:val="1"/>
+      <w:suff w:val="tab"/>
+    </w:lvl>
+    <w:lvl w:ilvl="8">
+      <w:isLgl w:val="false"/>
+      <w:lvlJc w:val="left"/>
+      <w:lvlText w:val="§"/>
+      <w:numFmt w:val="bullet"/>
+      <w:pPr>
+        <w:pBdr/>
+        <w:spacing/>
+        <w:ind w:hanging="360" w:left="6469"/>
+      </w:pPr>
+      <w:rPr>
+        <w:rFonts w:hint="default" w:ascii="Wingdings" w:hAnsi="Wingdings" w:eastAsia="Wingdings" w:cs="Wingdings"/>
+      </w:rPr>
+      <w:start w:val="1"/>
+      <w:suff w:val="tab"/>
+    </w:lvl>
+  </w:abstractNum>
   <w:num w:numId="1">
     <w:abstractNumId w:val="8"/>
   </w:num>
@@ -9532,6 +10198,9 @@
   </w:num>
   <w:num w:numId="11">
     <w:abstractNumId w:val="10"/>
+  </w:num>
+  <w:num w:numId="12">
+    <w:abstractNumId w:val="11"/>
   </w:num>
 </w:numbering>
 </file>

</xml_diff>